<commit_message>
content: align VALCAN pack with current V2 extractor
</commit_message>
<xml_diff>
--- a/data/canary/valcan_pack_2026-04-12/_VALCAN_2026/20_LOGISTICS/valcanary_calibration_completion_report_2024.docx
+++ b/data/canary/valcan_pack_2026-04-12/_VALCAN_2026/20_LOGISTICS/valcanary_calibration_completion_report_2024.docx
@@ -141,7 +141,7 @@
           </w:tcPr>
           <w:p>
             <w:r>
-              <w:t>VALSITE-ALPHA</w:t>
+              <w:t>Validation Alpha Site</w:t>
             </w:r>
           </w:p>
         </w:tc>
@@ -173,7 +173,7 @@
           </w:tcPr>
           <w:p>
             <w:r>
-              <w:t>VALSITE-BRAVO</w:t>
+              <w:t>Validation Bravo Site</w:t>
             </w:r>
           </w:p>
         </w:tc>
@@ -205,7 +205,7 @@
           </w:tcPr>
           <w:p>
             <w:r>
-              <w:t>VALSITE-CHARLIE</w:t>
+              <w:t>Validation Charlie Site</w:t>
             </w:r>
           </w:p>
         </w:tc>
@@ -237,7 +237,7 @@
           </w:tcPr>
           <w:p>
             <w:r>
-              <w:t>VALSITE-DELTA</w:t>
+              <w:t>Validation Delta Site</w:t>
             </w:r>
           </w:p>
         </w:tc>
@@ -269,7 +269,7 @@
           </w:tcPr>
           <w:p>
             <w:r>
-              <w:t>VALSITE-ECHO</w:t>
+              <w:t>Validation Echo Site</w:t>
             </w:r>
           </w:p>
         </w:tc>
@@ -301,7 +301,7 @@
           </w:tcPr>
           <w:p>
             <w:r>
-              <w:t>VALSITE-ALPHA</w:t>
+              <w:t>Validation Alpha Site</w:t>
             </w:r>
           </w:p>
         </w:tc>
@@ -333,7 +333,7 @@
           </w:tcPr>
           <w:p>
             <w:r>
-              <w:t>VALSITE-BRAVO</w:t>
+              <w:t>Validation Bravo Site</w:t>
             </w:r>
           </w:p>
         </w:tc>
@@ -365,7 +365,7 @@
           </w:tcPr>
           <w:p>
             <w:r>
-              <w:t>VALSITE-CHARLIE</w:t>
+              <w:t>Validation Charlie Site</w:t>
             </w:r>
           </w:p>
         </w:tc>

</xml_diff>